<commit_message>
Bake official IICT logo onto the cover pages of all massive reports and presentations
</commit_message>
<xml_diff>
--- a/IICT/fake_mail_project_report.docx
+++ b/IICT/fake_mail_project_report.docx
@@ -9,7 +9,7 @@
       <w:r>
         <w:drawing>
           <wp:inline>
-            <wp:extent cx="3121152" cy="3121152"/>
+            <wp:extent cx="5334000" cy="3572311"/>
             <wp:effectExtent b="0" l="0" r="0" t="0"/>
             <wp:docPr descr="" title="" id="10" name="Picture"/>
             <a:graphic>
@@ -30,7 +30,7 @@
                   <pic:spPr bwMode="auto">
                     <a:xfrm>
                       <a:off x="0" y="0"/>
-                      <a:ext cx="3121152" cy="3121152"/>
+                      <a:ext cx="5334000" cy="3572311"/>
                     </a:xfrm>
                     <a:prstGeom prst="rect">
                       <a:avLst/>

</xml_diff>